<commit_message>
docs(entrega): alinhar pacote a Sao Paulo e documentar auth de demonstracao
- Secao 11: nova linha de risco deixando explicito que o emissor de token
  admin (endpoint sem trava de ambiente) e apenas para teste/demonstracao e
  nao vai a producao
- Secao 2.3: municipio piloto ficticio "Vale Azul (0000001)" substituido por
  Sao Paulo (IBGE 3550308), alinhado aos seeds reais da aplicacao
- ROTEIRO_VIDEO_APLICACAO_5_MINUTOS: corrige abas de IA (sao 3, nao 4; busca
  semantica fica dentro de "Indices de atividades") e municipio do demo
- ROTEIRO_PITCH_5_MINUTOS (.md/.html/.pdf): "Vale Azul" -> Sao Paulo (3550308/SP)
- entrega/README.md: matriz de conformidade do item 17 (4 -> 5 riscos)
- Regenerados documento_entrega.html, PDF, DOCX e ZIP unificado a partir dos
  geradores (gerar_documento_html.py / gerar_documento_docx.py)

Co-Authored-By: Claude Opus 4.8 <noreply@anthropic.com>
</commit_message>
<xml_diff>
--- a/entrega/Entrega_Sistematizacao_RedeSolidaria.docx
+++ b/entrega/Entrega_Sistematizacao_RedeSolidaria.docx
@@ -1679,7 +1679,7 @@
           <w:color w:val="222222"/>
           <w:sz w:val="22"/>
         </w:rPr>
-        <w:t>Para fins de experimentação controlada e validação rigorosa dos modelos implementados no projeto, adotou-se o cenário piloto do município fictício Vale Azul (código IBGE simulado 0000001), representativo de uma localidade brasileira vulnerável, contendo três setores censitários críticos: a Várzea (inundável), a Encosta (escorregamentos) e o Centro (concentração de abrigados).</w:t>
+        <w:t>Para fins de experimentação controlada e validação rigorosa dos modelos implementados no projeto, adotou-se como cenário piloto o município de São Paulo (código IBGE 3550308), representativo de uma localidade brasileira densamente povoada e vulnerável, com uma ocorrência ilustrativa contendo três setores críticos: a Várzea (inundável), a Encosta (escorregamentos) e o Centro (concentração de abrigados).</w:t>
       </w:r>
     </w:p>
     <w:p>
@@ -5176,6 +5176,83 @@
                 <w:sz w:val="19"/>
               </w:rPr>
               <w:t>Apoio à decisão explicitando que proximidade não garante acesso seguro; evolução futura com camadas PostGIS de tráfego viário.</w:t>
+            </w:r>
+          </w:p>
+        </w:tc>
+      </w:tr>
+      <w:tr>
+        <w:tc>
+          <w:tcPr>
+            <w:tcW w:type="dxa" w:w="2592"/>
+            <w:shd w:fill="FFFFFF"/>
+            <w:tcMar>
+              <w:top w:w="90" w:type="dxa"/>
+              <w:bottom w:w="90" w:type="dxa"/>
+              <w:left w:w="120" w:type="dxa"/>
+              <w:right w:w="120" w:type="dxa"/>
+            </w:tcMar>
+          </w:tcPr>
+          <w:p>
+            <w:pPr>
+              <w:spacing w:before="0" w:after="0"/>
+            </w:pPr>
+            <w:r>
+              <w:rPr>
+                <w:rFonts w:ascii="Calibri" w:hAnsi="Calibri"/>
+                <w:color w:val="222222"/>
+                <w:sz w:val="19"/>
+              </w:rPr>
+              <w:t>5. Autenticação em Modo de Demonstração</w:t>
+            </w:r>
+          </w:p>
+        </w:tc>
+        <w:tc>
+          <w:tcPr>
+            <w:tcW w:type="dxa" w:w="3168"/>
+            <w:shd w:fill="FFFFFF"/>
+            <w:tcMar>
+              <w:top w:w="90" w:type="dxa"/>
+              <w:bottom w:w="90" w:type="dxa"/>
+              <w:left w:w="120" w:type="dxa"/>
+              <w:right w:w="120" w:type="dxa"/>
+            </w:tcMar>
+          </w:tcPr>
+          <w:p>
+            <w:pPr>
+              <w:spacing w:before="0" w:after="0"/>
+            </w:pPr>
+            <w:r>
+              <w:rPr>
+                <w:rFonts w:ascii="Calibri" w:hAnsi="Calibri"/>
+                <w:color w:val="222222"/>
+                <w:sz w:val="19"/>
+              </w:rPr>
+              <w:t>O emissor rápido de token administrativo (endpoint /api/v1/autenticacao/token-admin, sem trava de ambiente) gera acesso administrativo sem login federado.</w:t>
+            </w:r>
+          </w:p>
+        </w:tc>
+        <w:tc>
+          <w:tcPr>
+            <w:tcW w:type="dxa" w:w="3888"/>
+            <w:shd w:fill="FFFFFF"/>
+            <w:tcMar>
+              <w:top w:w="90" w:type="dxa"/>
+              <w:bottom w:w="90" w:type="dxa"/>
+              <w:left w:w="120" w:type="dxa"/>
+              <w:right w:w="120" w:type="dxa"/>
+            </w:tcMar>
+          </w:tcPr>
+          <w:p>
+            <w:pPr>
+              <w:spacing w:before="0" w:after="0"/>
+            </w:pPr>
+            <w:r>
+              <w:rPr>
+                <w:rFonts w:ascii="Calibri" w:hAnsi="Calibri"/>
+                <w:color w:val="222222"/>
+                <w:sz w:val="19"/>
+              </w:rPr>
+              <w:t>Recurso destinado exclusivamente a testes e à demonstração acadêmica desta entrega — não será levado a produção. A versão produtiva substituirá o emissor por autenticação federada com perfis granulares (coordenador, instituição e voluntário), com emissão restrita ao ambiente de desenvolvimento.</w:t>
             </w:r>
           </w:p>
         </w:tc>

</xml_diff>

<commit_message>
feat(frontend+entrega): separar login/cadastro, hero de voluntariado e destacar acessos
Frontend (Angular):
- Tela inicial separa o Acesso administrativo do cadastro de pessoa
- Novo hero estilizado de incentivo ao voluntariado com botao "Quero me voluntariar"
- Cadastro de voluntario passa a ter tela propria, com botao Voltar (signal telaPublica)

Entrega / documento:
- Box em destaque na Secao 1 com a aplicacao online
  (https://redesolidaria.myworklab.com.br/ - login admin e cadastro de voluntario)
  e o repositorio no GitHub; rotulo "Repositorio de Codigo" renomeado para "Stack Tecnologica"
- ROTEIRO_VIDEO: fluxo de cadastro atualizado (botao "Quero me voluntariar") e URLs
- ROTEIRO_PITCH (.md/.html/.pdf): URLs do site e do repositorio e autocadastro publico
- Regenerados documento_entrega.html, PDF (19p), DOCX, pitch PDF e ZIP unificado

Co-Authored-By: Claude Opus 4.8 <noreply@anthropic.com>
</commit_message>
<xml_diff>
--- a/entrega/Entrega_Sistematizacao_RedeSolidaria.docx
+++ b/entrega/Entrega_Sistematizacao_RedeSolidaria.docx
@@ -1323,7 +1323,7 @@
                 <w:color w:val="1F2A44"/>
                 <w:sz w:val="21"/>
               </w:rPr>
-              <w:t xml:space="preserve">Repositório de Código: </w:t>
+              <w:t xml:space="preserve">Stack Tecnológica: </w:t>
             </w:r>
             <w:r>
               <w:rPr>
@@ -1333,6 +1333,109 @@
                 <w:sz w:val="21"/>
               </w:rPr>
               <w:t>Arquitetura em camadas Python (FastAPI/SQLAlchemy), Frontend Angular 21, PostgreSQL 18 e LangGraph/LangChain.</w:t>
+            </w:r>
+          </w:p>
+        </w:tc>
+      </w:tr>
+    </w:tbl>
+    <w:p>
+      <w:pPr>
+        <w:spacing w:before="0" w:after="80"/>
+      </w:pPr>
+    </w:p>
+    <w:tbl>
+      <w:tblPr>
+        <w:tblW w:type="auto" w:w="0"/>
+        <w:jc w:val="center"/>
+        <w:tblLook w:firstColumn="1" w:firstRow="1" w:lastColumn="0" w:lastRow="0" w:noHBand="0" w:noVBand="1" w:val="04A0"/>
+      </w:tblPr>
+      <w:tblGrid>
+        <w:gridCol w:w="9936"/>
+      </w:tblGrid>
+      <w:tr>
+        <w:tc>
+          <w:tcPr>
+            <w:tcW w:type="dxa" w:w="9936"/>
+            <w:shd w:fill="E0F2FE"/>
+            <w:tcMar>
+              <w:top w:w="140" w:type="dxa"/>
+              <w:bottom w:w="140" w:type="dxa"/>
+              <w:left w:w="200" w:type="dxa"/>
+              <w:right w:w="200" w:type="dxa"/>
+            </w:tcMar>
+            <w:tcBorders>
+              <w:top w:val="none"/>
+              <w:left w:val="single" w:sz="24" w:space="0" w:color="0284C7"/>
+              <w:bottom w:val="none"/>
+              <w:right w:val="none"/>
+            </w:tcBorders>
+          </w:tcPr>
+          <w:p>
+            <w:pPr>
+              <w:spacing w:before="0" w:after="40" w:line="276" w:lineRule="auto"/>
+            </w:pPr>
+            <w:r>
+              <w:rPr>
+                <w:rFonts w:ascii="Calibri" w:hAnsi="Calibri"/>
+                <w:b/>
+                <w:i w:val="0"/>
+                <w:color w:val="1F4D78"/>
+                <w:sz w:val="21"/>
+              </w:rPr>
+              <w:t>Acesso ao Projeto</w:t>
+              <w:br/>
+            </w:r>
+            <w:r>
+              <w:rPr>
+                <w:rFonts w:ascii="Calibri" w:hAnsi="Calibri"/>
+                <w:b/>
+                <w:i w:val="0"/>
+                <w:color w:val="1F2A44"/>
+                <w:sz w:val="21"/>
+              </w:rPr>
+              <w:t xml:space="preserve">Aplicação online: </w:t>
+            </w:r>
+            <w:r>
+              <w:rPr>
+                <w:rFonts w:ascii="Calibri" w:hAnsi="Calibri"/>
+                <w:b w:val="0"/>
+                <w:i w:val="0"/>
+                <w:color w:val="1F4D78"/>
+                <w:sz w:val="21"/>
+              </w:rPr>
+              <w:t>https://redesolidaria.myworklab.com.br/</w:t>
+              <w:br/>
+            </w:r>
+            <w:r>
+              <w:rPr>
+                <w:rFonts w:ascii="Calibri" w:hAnsi="Calibri"/>
+                <w:b w:val="0"/>
+                <w:i/>
+                <w:color w:val="666666"/>
+                <w:sz w:val="21"/>
+              </w:rPr>
+              <w:t>Tela inicial com acesso administrativo (login por token) e cadastro de voluntário pelo botão “Quero me voluntariar”.</w:t>
+              <w:br/>
+            </w:r>
+            <w:r>
+              <w:rPr>
+                <w:rFonts w:ascii="Calibri" w:hAnsi="Calibri"/>
+                <w:b/>
+                <w:i w:val="0"/>
+                <w:color w:val="1F2A44"/>
+                <w:sz w:val="21"/>
+              </w:rPr>
+              <w:t xml:space="preserve">Repositório (código-fonte): </w:t>
+            </w:r>
+            <w:r>
+              <w:rPr>
+                <w:rFonts w:ascii="Calibri" w:hAnsi="Calibri"/>
+                <w:b w:val="0"/>
+                <w:i w:val="0"/>
+                <w:color w:val="1F4D78"/>
+                <w:sz w:val="21"/>
+              </w:rPr>
+              <w:t>https://github.com/luisrobertolrm/sistematizacao-arquiteturas-convergentes/tree/main</w:t>
             </w:r>
           </w:p>
         </w:tc>

</xml_diff>

<commit_message>
docs(entrega): adicionar box final com site, repositorio e link do video
- Novo box em destaque ao fim do documento (apos as Referencias) com:
  aplicacao online, repositorio e video de demonstracao (https://youtu.be/lUjrWGrS9o0)
- Regenerados documento_entrega.html, PDF (19p), DOCX e ZIP unificado

Co-Authored-By: Claude Opus 4.8 <noreply@anthropic.com>
</commit_message>
<xml_diff>
--- a/entrega/Entrega_Sistematizacao_RedeSolidaria.docx
+++ b/entrega/Entrega_Sistematizacao_RedeSolidaria.docx
@@ -6234,6 +6234,119 @@
         <w:t>RFC 9457: Problem Details for HTTP APIs. Disponível em: &lt;https://datatracker.ietf.org/doc/html/rfc9457&gt;. Acesso em: 2026.</w:t>
       </w:r>
     </w:p>
+    <w:tbl>
+      <w:tblPr>
+        <w:tblW w:type="auto" w:w="0"/>
+        <w:jc w:val="center"/>
+        <w:tblLook w:firstColumn="1" w:firstRow="1" w:lastColumn="0" w:lastRow="0" w:noHBand="0" w:noVBand="1" w:val="04A0"/>
+      </w:tblPr>
+      <w:tblGrid>
+        <w:gridCol w:w="9936"/>
+      </w:tblGrid>
+      <w:tr>
+        <w:tc>
+          <w:tcPr>
+            <w:tcW w:type="dxa" w:w="9936"/>
+            <w:shd w:fill="E0F2FE"/>
+            <w:tcMar>
+              <w:top w:w="140" w:type="dxa"/>
+              <w:bottom w:w="140" w:type="dxa"/>
+              <w:left w:w="200" w:type="dxa"/>
+              <w:right w:w="200" w:type="dxa"/>
+            </w:tcMar>
+            <w:tcBorders>
+              <w:top w:val="none"/>
+              <w:left w:val="single" w:sz="24" w:space="0" w:color="0284C7"/>
+              <w:bottom w:val="none"/>
+              <w:right w:val="none"/>
+            </w:tcBorders>
+          </w:tcPr>
+          <w:p>
+            <w:pPr>
+              <w:spacing w:before="0" w:after="40" w:line="276" w:lineRule="auto"/>
+            </w:pPr>
+            <w:r>
+              <w:rPr>
+                <w:rFonts w:ascii="Calibri" w:hAnsi="Calibri"/>
+                <w:b/>
+                <w:i w:val="0"/>
+                <w:color w:val="1F4D78"/>
+                <w:sz w:val="21"/>
+              </w:rPr>
+              <w:t>Acesso ao Projeto e Demonstração em Vídeo</w:t>
+              <w:br/>
+            </w:r>
+            <w:r>
+              <w:rPr>
+                <w:rFonts w:ascii="Calibri" w:hAnsi="Calibri"/>
+                <w:b/>
+                <w:i w:val="0"/>
+                <w:color w:val="1F2A44"/>
+                <w:sz w:val="21"/>
+              </w:rPr>
+              <w:t xml:space="preserve">Aplicação online: </w:t>
+            </w:r>
+            <w:r>
+              <w:rPr>
+                <w:rFonts w:ascii="Calibri" w:hAnsi="Calibri"/>
+                <w:b w:val="0"/>
+                <w:i w:val="0"/>
+                <w:color w:val="1F4D78"/>
+                <w:sz w:val="21"/>
+              </w:rPr>
+              <w:t>https://redesolidaria.myworklab.com.br/</w:t>
+              <w:br/>
+            </w:r>
+            <w:r>
+              <w:rPr>
+                <w:rFonts w:ascii="Calibri" w:hAnsi="Calibri"/>
+                <w:b/>
+                <w:i w:val="0"/>
+                <w:color w:val="1F2A44"/>
+                <w:sz w:val="21"/>
+              </w:rPr>
+              <w:t xml:space="preserve">Repositório (código-fonte): </w:t>
+            </w:r>
+            <w:r>
+              <w:rPr>
+                <w:rFonts w:ascii="Calibri" w:hAnsi="Calibri"/>
+                <w:b w:val="0"/>
+                <w:i w:val="0"/>
+                <w:color w:val="1F4D78"/>
+                <w:sz w:val="21"/>
+              </w:rPr>
+              <w:t>https://github.com/luisrobertolrm/sistematizacao-arquiteturas-convergentes/tree/main</w:t>
+              <w:br/>
+            </w:r>
+            <w:r>
+              <w:rPr>
+                <w:rFonts w:ascii="Calibri" w:hAnsi="Calibri"/>
+                <w:b/>
+                <w:i w:val="0"/>
+                <w:color w:val="1F2A44"/>
+                <w:sz w:val="21"/>
+              </w:rPr>
+              <w:t xml:space="preserve">Vídeo de demonstração: </w:t>
+            </w:r>
+            <w:r>
+              <w:rPr>
+                <w:rFonts w:ascii="Calibri" w:hAnsi="Calibri"/>
+                <w:b w:val="0"/>
+                <w:i w:val="0"/>
+                <w:color w:val="1F4D78"/>
+                <w:sz w:val="21"/>
+              </w:rPr>
+              <w:t>https://youtu.be/lUjrWGrS9o0</w:t>
+            </w:r>
+          </w:p>
+        </w:tc>
+      </w:tr>
+    </w:tbl>
+    <w:p>
+      <w:pPr>
+        <w:spacing w:before="0" w:after="80"/>
+      </w:pPr>
+    </w:p>
     <w:sectPr>
       <w:pgSz w:w="12240" w:h="15840"/>
       <w:pgMar w:top="1152" w:right="1152" w:bottom="1152" w:left="1152" w:header="720" w:footer="720" w:gutter="0"/>

</xml_diff>